<commit_message>
Checkpoint Persist refresh tokens
</commit_message>
<xml_diff>
--- a/docs/Authentication and Authorisation.docx
+++ b/docs/Authentication and Authorisation.docx
@@ -379,22 +379,10 @@
     </w:p>
     <w:p>
       <w:r>
-        <w:t>Only t</w:t>
-      </w:r>
-      <w:r>
-        <w:t>he Backend API controllers</w:t>
-      </w:r>
-      <w:r>
-        <w:t xml:space="preserve"> contain authorisation controls. Services and Repositories </w:t>
-      </w:r>
-      <w:r>
-        <w:t xml:space="preserve">are not checked for </w:t>
-      </w:r>
-      <w:r>
-        <w:t>authorisation</w:t>
-      </w:r>
-      <w:r>
-        <w:t>. Note these are not exposed outside the application.</w:t>
+        <w:t xml:space="preserve">Only the Backend API controllers contain authorisation controls. Services and Repositories </w:t>
+      </w:r>
+      <w:r>
+        <w:t>are not checked for authorisation. Note these are not exposed outside the application.</w:t>
       </w:r>
     </w:p>
     <w:p>
@@ -451,10 +439,7 @@
         </w:numPr>
       </w:pPr>
       <w:r>
-        <w:t>Backend API</w:t>
-      </w:r>
-      <w:r>
-        <w:t xml:space="preserve"> controllers are annotated with </w:t>
+        <w:t xml:space="preserve">Backend API controllers are annotated with </w:t>
       </w:r>
       <w:proofErr w:type="spellStart"/>
       <w:proofErr w:type="gramStart"/>
@@ -488,13 +473,7 @@
         <w:t xml:space="preserve"> at the class level.</w:t>
       </w:r>
       <w:r>
-        <w:t xml:space="preserve"> Each method within the class is </w:t>
-      </w:r>
-      <w:r>
-        <w:t>annotated</w:t>
-      </w:r>
-      <w:r>
-        <w:t xml:space="preserve"> with a CRUD attribute </w:t>
+        <w:t xml:space="preserve"> Each method within the class is annotated with a CRUD attribute </w:t>
       </w:r>
       <w:proofErr w:type="spellStart"/>
       <w:proofErr w:type="gramStart"/>
@@ -551,13 +530,7 @@
         <w:t xml:space="preserve"> Values are</w:t>
       </w:r>
       <w:r>
-        <w:t xml:space="preserve"> </w:t>
-      </w:r>
-      <w:r>
-        <w:t>hard coded</w:t>
-      </w:r>
-      <w:r>
-        <w:t>. The possible values are</w:t>
+        <w:t xml:space="preserve"> hard coded. The possible values are</w:t>
       </w:r>
       <w:r>
         <w:t>:</w:t>

</xml_diff>